<commit_message>
feat(gactapp): amicus-brief gated on the model at HEAD: latex and docx 655/655; INPUT code sections rejoined where the transcription split them ("21-2- 230"); last paragraph kept with the closing (fb-595.54.59)
Co-Authored-By: Claude Opus 5.5 <noreply@anthropic.com>
</commit_message>
<xml_diff>
--- a/courts/eleventh-circuit/georgia/state/court-of-appeals/amicus-brief/usage/OUTPUT-amicus-brief.docx
+++ b/courts/eleventh-circuit/georgia/state/court-of-appeals/amicus-brief/usage/OUTPUT-amicus-brief.docx
@@ -1600,11 +1600,7 @@
         <w:t xml:space="preserve"> </w:t>
       </w:r>
       <w:r>
-        <w:t xml:space="preserve">21</w:t>
-        <w:noBreakHyphen/>
-        <w:t xml:space="preserve">2</w:t>
-        <w:noBreakHyphen/>
-        <w:t xml:space="preserve">229</w:t>
+        <w:t xml:space="preserve">21-⁠2-⁠229</w:t>
       </w:r>
       <w:r>
         <w:t xml:space="preserve"> </w:t>
@@ -1678,11 +1674,7 @@
         <w:t xml:space="preserve"> </w:t>
       </w:r>
       <w:r>
-        <w:t xml:space="preserve">21</w:t>
-        <w:noBreakHyphen/>
-        <w:t xml:space="preserve">2</w:t>
-        <w:noBreakHyphen/>
-        <w:t xml:space="preserve">229</w:t>
+        <w:t xml:space="preserve">21-⁠2-⁠229</w:t>
       </w:r>
       <w:r>
         <w:t xml:space="preserve"> </w:t>
@@ -2363,7 +2355,7 @@
         <w:tab/>
       </w:r>
       <w:r>
-        <w:t xml:space="preserve">28</w:t>
+        <w:t xml:space="preserve">29</w:t>
       </w:r>
     </w:p>
     <w:p>
@@ -2535,19 +2527,7 @@
         <w:pStyle w:val="BodyText"/>
       </w:pPr>
       <w:r>
-        <w:t xml:space="preserve">Appellants seek to remove 14,346 registered Fulton County voters (the “Targeted Voters”) from the registration rolls, largely based on alleged postal service change-of-address data, under the registration and voter challenge procedures prescribed in O.G.C.A. §§ 21</w:t>
-      </w:r>
-      <w:r>
-        <w:noBreakHyphen/>
-      </w:r>
-      <w:r>
-        <w:t xml:space="preserve">2</w:t>
-      </w:r>
-      <w:r>
-        <w:noBreakHyphen/>
-      </w:r>
-      <w:r>
-        <w:t xml:space="preserve">229 and 21</w:t>
+        <w:t xml:space="preserve">Appellants seek to remove 14,346 registered Fulton County voters (the “Targeted Voters”) from the registration rolls, largely based on alleged postal service change-of-address data, under the registration and voter challenge procedures prescribed in O.G.C.A. §§ 21-⁠2-⁠229 and 21</w:t>
       </w:r>
       <w:r>
         <w:noBreakHyphen/>
@@ -2809,19 +2789,7 @@
         <w:tab/>
       </w:r>
       <w:r>
-        <w:t xml:space="preserve">O.C.G.A. § 21</w:t>
-      </w:r>
-      <w:r>
-        <w:noBreakHyphen/>
-      </w:r>
-      <w:r>
-        <w:t xml:space="preserve">2</w:t>
-      </w:r>
-      <w:r>
-        <w:noBreakHyphen/>
-      </w:r>
-      <w:r>
-        <w:t xml:space="preserve">229 imposes no time limit on the Board to conduct the requested challenge hearings, and the Board’s July 2020 correspondence indicating it would take any necessary action on the voter challenges after the January 2021 federal elections satisfied the statutory requirements;</w:t>
+        <w:t xml:space="preserve">O.C.G.A. § 21-⁠2-⁠229 imposes no time limit on the Board to conduct the requested challenge hearings, and the Board’s July 2020 correspondence indicating it would take any necessary action on the voter challenges after the January 2021 federal elections satisfied the statutory requirements;</w:t>
       </w:r>
     </w:p>
     <w:p>
@@ -2835,19 +2803,7 @@
         <w:tab/>
       </w:r>
       <w:r>
-        <w:t xml:space="preserve">O.C.G.A. §§ 21</w:t>
-      </w:r>
-      <w:r>
-        <w:noBreakHyphen/>
-      </w:r>
-      <w:r>
-        <w:t xml:space="preserve">2</w:t>
-      </w:r>
-      <w:r>
-        <w:noBreakHyphen/>
-      </w:r>
-      <w:r>
-        <w:t xml:space="preserve">229 and 21</w:t>
+        <w:t xml:space="preserve">O.C.G.A. §§ 21-⁠2-⁠229 and 21</w:t>
       </w:r>
       <w:r>
         <w:noBreakHyphen/>
@@ -3283,11 +3239,7 @@
           <w:i/>
           <w:iCs/>
         </w:rPr>
-        <w:t xml:space="preserve">21</w:t>
-        <w:noBreakHyphen/>
-        <w:t xml:space="preserve">2</w:t>
-        <w:noBreakHyphen/>
-        <w:t xml:space="preserve">229</w:t>
+        <w:t xml:space="preserve">21-⁠2-⁠229</w:t>
       </w:r>
       <w:r>
         <w:rPr>
@@ -3335,7 +3287,7 @@
         <w:pStyle w:val="BodyText"/>
       </w:pPr>
       <w:r>
-        <w:t xml:space="preserve">As the Superior Court correctly held, Appellants’ demand that the Board comply with O.C.G.A §§ 21</w:t>
+        <w:t xml:space="preserve">As the Superior Court correctly held, Appellants’ demand that the Board comply with O.C.G.A §§ 21-⁠2-⁠229 and 21</w:t>
       </w:r>
       <w:r>
         <w:noBreakHyphen/>
@@ -3347,6 +3299,82 @@
         <w:noBreakHyphen/>
       </w:r>
       <w:r>
+        <w:t xml:space="preserve">230 requires no relief because the Board is already complying with both statutes. Despite Appellants’ assertion to the contrary, the plain text of the statutes does not require or even contemplate immediate hearings for voter challenges.</w:t>
+      </w:r>
+    </w:p>
+    <w:p>
+      <w:pPr>
+        <w:pStyle w:val="BodyTextNote"/>
+      </w:pPr>
+      <w:r>
+        <w:t xml:space="preserve">As an initial matter, Section 21</w:t>
+      </w:r>
+      <w:r>
+        <w:noBreakHyphen/>
+      </w:r>
+      <w:r>
+        <w:t xml:space="preserve">2</w:t>
+      </w:r>
+      <w:r>
+        <w:noBreakHyphen/>
+      </w:r>
+      <w:r>
+        <w:t xml:space="preserve">229(a) states that any challenge to an individual’s qualifications to register must “specify distinctly the grounds of the challenge.” But Appellants have failed to so specify. Due to the en-masse nature of their challenge, Appellants have not identified a clear basis for challenging the residency of any particular Targeted Voter. Indeed, they do not even appear to specify which residency challenges apply to each voter—some they claim have moved residence generally, others they claim have simply moved away from Fulton County. See Pet., Exs. A, B. And it is wholly unclear which source of information, i.e., the National Change-of-Address list or other purported proofs, serves as the basis for their challenges. Thus, it is little wonder that the Board (even outside of its NVRA obligations) is engaging in its own, independent review before scheduling hearings. See Pet., Exs. D, F. Accordingly, the Board has complied with the requirements of the statute. More fundamentally, Section 21</w:t>
+      </w:r>
+      <w:r>
+        <w:noBreakHyphen/>
+      </w:r>
+      <w:r>
+        <w:t xml:space="preserve">2</w:t>
+      </w:r>
+      <w:r>
+        <w:noBreakHyphen/>
+      </w:r>
+      <w:r>
+        <w:t xml:space="preserve">229(b) does not provide a specific timeframe within which the hearing must be held.</w:t>
+      </w:r>
+      <w:r>
+        <w:rPr>
+          <w:rStyle w:val="FootnoteReference"/>
+        </w:rPr>
+        <w:footnoteReference w:id="10"/>
+      </w:r>
+      <w:r>
+        <w:t xml:space="preserve"> </w:t>
+      </w:r>
+      <w:r>
+        <w:t xml:space="preserve">See O.C.G.A. 21</w:t>
+      </w:r>
+      <w:r>
+        <w:noBreakHyphen/>
+      </w:r>
+      <w:r>
+        <w:t xml:space="preserve">2</w:t>
+      </w:r>
+      <w:r>
+        <w:noBreakHyphen/>
+      </w:r>
+      <w:r>
+        <w:t xml:space="preserve">229(b) (“[u]pon such challenge being filed with the board of registrars, the registrars shall set a hearing on such challenge. Notice of the date, time, and place of the hearing shall be served [and] [t]he person being challenged shall receive at least three days’ notice of the date, time, and place of the hearing.”). The only timing strictures placed on the Board are that the challenged voter must receive at least three-days’ notice. Thus, the Board’s indication that it will set hearings as necessary after completing its initial review is wholly in line with the statute and, as such, there was nothing for the Superior Court to issue a writ of mandamus for as the Board was (and remains) in compliance with all statutory requirements.</w:t>
+      </w:r>
+    </w:p>
+    <w:p>
+      <w:pPr>
+        <w:pStyle w:val="BodyTextNote"/>
+      </w:pPr>
+      <w:r>
+        <w:t xml:space="preserve">The absence of such a timeframe is precisely why Appellants try to reverse-engineer a deadline by grafting immediacy language from another statutory section. Petitioners requested a writ of mandamus compelling the Board to set “an immediate hearing on Petitioners’ challenge” under Sections 21</w:t>
+      </w:r>
+      <w:r>
+        <w:noBreakHyphen/>
+      </w:r>
+      <w:r>
+        <w:t xml:space="preserve">2</w:t>
+      </w:r>
+      <w:r>
+        <w:noBreakHyphen/>
+      </w:r>
+      <w:r>
         <w:t xml:space="preserve">229 and 21</w:t>
       </w:r>
       <w:r>
@@ -3359,15 +3387,7 @@
         <w:noBreakHyphen/>
       </w:r>
       <w:r>
-        <w:t xml:space="preserve">230 requires no relief because the Board is already complying with both statutes. Despite Appellants’ assertion to the contrary, the plain text of the statutes does not require or even contemplate immediate hearings for voter challenges.</w:t>
-      </w:r>
-    </w:p>
-    <w:p>
-      <w:pPr>
-        <w:pStyle w:val="BodyTextNote"/>
-      </w:pPr>
-      <w:r>
-        <w:t xml:space="preserve">As an initial matter, Section 21</w:t>
+        <w:t xml:space="preserve">230. Pet. ¶ 6. Section 21</w:t>
       </w:r>
       <w:r>
         <w:noBreakHyphen/>
@@ -3379,7 +3399,7 @@
         <w:noBreakHyphen/>
       </w:r>
       <w:r>
-        <w:t xml:space="preserve">229(a) states that any challenge to an individual’s qualifications to register must “specify distinctly the grounds of the challenge.” But Appellants have failed to so specify. Due to the en-masse nature of their challenge, Appellants have not identified a clear basis for challenging the residency of any particular Targeted Voter. Indeed, they do not even appear to specify which residency challenges apply to each voter—some they claim have moved residence generally, others they claim have simply moved away from Fulton County. See Pet., Exs. A, B. And it is wholly unclear which source of information, i.e., the National Change-of-Address list or other purported proofs, serves as the basis for their challenges. Thus, it is little wonder that the Board (even outside of its NVRA obligations) is engaging in its own, independent review before scheduling hearings. See Pet., Exs. D, F. Accordingly, the Board has complied with the requirements of the statute. More fundamentally, Section 21</w:t>
+        <w:t xml:space="preserve">229(b) does provide for hearings upon a challenge to a voter’s registration eligibility, but the section does not require that hearings be held “immediately.” And so Petitioners borrow from Section 21</w:t>
       </w:r>
       <w:r>
         <w:noBreakHyphen/>
@@ -3391,19 +3411,19 @@
         <w:noBreakHyphen/>
       </w:r>
       <w:r>
-        <w:t xml:space="preserve">229(b) does not provide a specific timeframe within which the hearing must be held.</w:t>
+        <w:t xml:space="preserve">230(b), which provides for “immediate consideration” of challenges to a person’s right to vote (as opposed to registration eligibility), but does not provide for hearings.</w:t>
       </w:r>
       <w:r>
         <w:rPr>
           <w:rStyle w:val="FootnoteReference"/>
         </w:rPr>
-        <w:footnoteReference w:id="10"/>
-      </w:r>
-      <w:r>
-        <w:t xml:space="preserve"> </w:t>
-      </w:r>
-      <w:r>
-        <w:t xml:space="preserve">See O.C.G.A. 21</w:t>
+        <w:footnoteReference w:id="11"/>
+      </w:r>
+      <w:r>
+        <w:t xml:space="preserve"> </w:t>
+      </w:r>
+      <w:r>
+        <w:t xml:space="preserve">Rather, the Board is required initially only to “consider such challenge and determine whether probable cause exists to sustain such challenge.” Id. (emphasis added). Here, the Board has initiated a procedure to consider the Petitioner’s challenge to Targeted Voters under Section 21</w:t>
       </w:r>
       <w:r>
         <w:noBreakHyphen/>
@@ -3415,15 +3435,7 @@
         <w:noBreakHyphen/>
       </w:r>
       <w:r>
-        <w:t xml:space="preserve">229(b) (“[u]pon such challenge being filed with the board of registrars, the registrars shall set a hearing on such challenge. Notice of the date, time, and place of the hearing shall be served [and] [t]he person being challenged shall receive at least three days’ notice of the date, time, and place of the hearing.”). The only timing strictures placed on the Board are that the challenged voter must receive at least three-days’ notice. Thus, the Board’s indication that it will set hearings as necessary after completing its initial review is wholly in line with the statute and, as such, there was nothing for the Superior Court to issue a writ of mandamus for as the Board was (and remains) in compliance with all statutory requirements.</w:t>
-      </w:r>
-    </w:p>
-    <w:p>
-      <w:pPr>
-        <w:pStyle w:val="BodyTextNote"/>
-      </w:pPr>
-      <w:r>
-        <w:t xml:space="preserve">The absence of such a timeframe is precisely why Appellants try to reverse-engineer a deadline by grafting immediacy language from another statutory section. Petitioners requested a writ of mandamus compelling the Board to set “an immediate hearing on Petitioners’ challenge” under Sections 21</w:t>
+        <w:t xml:space="preserve">230 by reviewing vital records to determine voter qualifications. Pet., Ex. D. This search allows it to “determine whether probable cause exists to sustain such a challenge,” as the statute provides. § 21-⁠2-⁠230(b). Thus, contrary to Appellants’ representations and consistent with the Superior Court’s ruling, the Board is acting wholly in line with Sections 21</w:t>
       </w:r>
       <w:r>
         <w:noBreakHyphen/>
@@ -3447,85 +3459,7 @@
         <w:noBreakHyphen/>
       </w:r>
       <w:r>
-        <w:t xml:space="preserve">230. Pet. ¶ 6. Section 21</w:t>
-      </w:r>
-      <w:r>
-        <w:noBreakHyphen/>
-      </w:r>
-      <w:r>
-        <w:t xml:space="preserve">2</w:t>
-      </w:r>
-      <w:r>
-        <w:noBreakHyphen/>
-      </w:r>
-      <w:r>
-        <w:t xml:space="preserve">229(b) does provide for hearings upon a challenge to a voter’s registration eligibility, but the section does not require that hearings be held “immediately.” And so Petitioners borrow from Section 21</w:t>
-      </w:r>
-      <w:r>
-        <w:noBreakHyphen/>
-      </w:r>
-      <w:r>
-        <w:t xml:space="preserve">2</w:t>
-      </w:r>
-      <w:r>
-        <w:noBreakHyphen/>
-      </w:r>
-      <w:r>
-        <w:t xml:space="preserve">230(b), which provides for “immediate consideration” of challenges to a person’s right to vote (as opposed to registration eligibility), but does not provide for hearings.</w:t>
-      </w:r>
-      <w:r>
-        <w:rPr>
-          <w:rStyle w:val="FootnoteReference"/>
-        </w:rPr>
-        <w:footnoteReference w:id="11"/>
-      </w:r>
-      <w:r>
-        <w:t xml:space="preserve"> </w:t>
-      </w:r>
-      <w:r>
-        <w:t xml:space="preserve">Rather, the Board is required initially only to “consider such challenge and determine whether probable cause exists to sustain such challenge.” Id. (emphasis added). Here, the Board has initiated a procedure to consider the Petitioner’s challenge to Targeted Voters under Section 21</w:t>
-      </w:r>
-      <w:r>
-        <w:noBreakHyphen/>
-      </w:r>
-      <w:r>
-        <w:t xml:space="preserve">2</w:t>
-      </w:r>
-      <w:r>
-        <w:noBreakHyphen/>
-      </w:r>
-      <w:r>
-        <w:t xml:space="preserve">230 by reviewing vital records to determine voter qualifications. Pet., Ex. D. This search allows it to “determine whether probable cause exists to sustain such a challenge,” as the statute provides. § 21</w:t>
-      </w:r>
-      <w:r>
-        <w:noBreakHyphen/>
-      </w:r>
-      <w:r>
-        <w:t xml:space="preserve">2</w:t>
-      </w:r>
-      <w:r>
-        <w:noBreakHyphen/>
-      </w:r>
-      <w:r>
-        <w:t xml:space="preserve">230(b). Thus, contrary to Appellants’ representations and consistent with the Superior Court’s ruling, the Board is acting wholly in line with Sections 21</w:t>
-      </w:r>
-      <w:r>
-        <w:noBreakHyphen/>
-      </w:r>
-      <w:r>
-        <w:t xml:space="preserve">2</w:t>
-      </w:r>
-      <w:r>
-        <w:noBreakHyphen/>
-      </w:r>
-      <w:r>
-        <w:t xml:space="preserve">229 and 21</w:t>
-      </w:r>
-      <w:r>
-        <w:noBreakHyphen/>
-      </w:r>
-      <w:r>
-        <w:t xml:space="preserve">2- 230 and has never refused to hold the hearings Appellants demand. What the Board did decline to do, however, was initiate a massive witch hunt on the basis of an enormous list, of suspect provenance, targeting voters just weeks before the November general election, and now before the January run-off, who may or may not have moved out of Fulton County. Such voter intimidation is not required by either Section 21</w:t>
+        <w:t xml:space="preserve">230 and has never refused to hold the hearings Appellants demand. What the Board did decline to do, however, was initiate a massive witch hunt on the basis of an enormous list, of suspect provenance, targeting voters just weeks before the November general election, and now before the January run-off, who may or may not have moved out of Fulton County. Such voter intimidation is not required by either Section 21</w:t>
       </w:r>
       <w:r>
         <w:noBreakHyphen/>
@@ -3675,11 +3609,7 @@
           <w:i/>
           <w:iCs/>
         </w:rPr>
-        <w:t xml:space="preserve">21</w:t>
-        <w:noBreakHyphen/>
-        <w:t xml:space="preserve">2</w:t>
-        <w:noBreakHyphen/>
-        <w:t xml:space="preserve">229</w:t>
+        <w:t xml:space="preserve">21-⁠2-⁠229</w:t>
       </w:r>
       <w:r>
         <w:rPr>
@@ -4253,7 +4183,7 @@
         <w:noBreakHyphen/>
       </w:r>
       <w:r>
-        <w:t xml:space="preserve">7. The court relied heavily on the Eleventh Circuit’s NVRA analysis in Arcia v. Florida Secretary of State, 772 F.3d 1335, 1346 (11th Cir. 2014), which held that “the NVRA’s prohibition on systematically removing voters within 90 days of the general election ‘is designed to carefully balance these four competing purposes in the NVRA . . . by limiting its reach to programs that ‘systematically’ remove voters from the voter rolls’ but allowing removals ‘based on individualized information at any time.’” N.C. State Conf. of NAACP, 2018 WL 3748172, at *6 (quoting Arcia, 772 F.3d at 1346). This is because, while “[a]t most times during the election cycle, the benefits of systematic programs outweigh the costs because eligible voters who are incorrectly removed have enough time to rectify any errors[,] . . . [e]ligible voters removed days or weeks before Election Day will likely not be able to correct the State’s errors in time to vote.” Arcia, 772 F.3d at 1346.</w:t>
+        <w:t xml:space="preserve">7. The court relied heavily on the Eleventh Circuit’s NVRA analysis in Arcia v. Florida Secretary of State, 772 F.3d 1335, 1346 (11th Cir. 2014), which held that “the NVRA’s prohibition on systematically removing voters within 90 days of the general election ‘is designed to carefully balance these four competing purposes in the NVRA . . . by limiting its reach to programs that ‘systematically’ remove voters from the voter rolls’ but allowing removals ‘based on individualized information at any time.’” N.C. State Conf. of NAACP, 2018 WL 3748172, at *6 (quoting Arcia, 772 F.3d at 1346). This is because, while “[a]t most times during the election cycle, the benefits of systematic programs outweigh the costs because eligible voters who are incorrectly removed have enough time to rectify any errors[,] . . . [e]ligible voters removed days or weeks before Election Day will likely not be able to correct the State’s errors in time to vote.” Arcia, 772 F.3d at 1346.</w:t>
       </w:r>
     </w:p>
     <w:p>
@@ -4413,61 +4343,7 @@
         <w:pStyle w:val="BodyText"/>
       </w:pPr>
       <w:r>
-        <w:t xml:space="preserve">These precautions are crucial because the fact that a voter moves temporarily or requests mail to be forwarded to another address—the primary basis for Appellants’ challenges—does not in any way render the voter ineligible to vote. While the place that a person receives significant mail, such as personal bills, may be evidence of the person’s residency for voter registration purposes, O.C.G.A. § 21- 2</w:t>
-      </w:r>
-      <w:r>
-        <w:noBreakHyphen/>
-      </w:r>
-      <w:r>
-        <w:t xml:space="preserve">217(15), both the Election Code and federal law enumerate legitimate reasons that individuals may change their mail address, even out of state, without forfeiting their eligibility to vote. These reasons include: moving for temporary purposes, § 21</w:t>
-      </w:r>
-      <w:r>
-        <w:noBreakHyphen/>
-      </w:r>
-      <w:r>
-        <w:t xml:space="preserve">2- 217(a)⁠(2); moving to engage in government service, § 21</w:t>
-      </w:r>
-      <w:r>
-        <w:noBreakHyphen/>
-      </w:r>
-      <w:r>
-        <w:t xml:space="preserve">2</w:t>
-      </w:r>
-      <w:r>
-        <w:noBreakHyphen/>
-      </w:r>
-      <w:r>
-        <w:t xml:space="preserve">217(a)⁠(11); and intending to move without actually moving, § 21</w:t>
-      </w:r>
-      <w:r>
-        <w:noBreakHyphen/>
-      </w:r>
-      <w:r>
-        <w:t xml:space="preserve">2</w:t>
-      </w:r>
-      <w:r>
-        <w:noBreakHyphen/>
-      </w:r>
-      <w:r>
-        <w:t xml:space="preserve">217(a)⁠(9). See also 52 U.S.C. § 20302(a)⁠(1) (providing for voting by absent uniformed voters and overseas voters); O.C.G.A. § 21</w:t>
-      </w:r>
-      <w:r>
-        <w:noBreakHyphen/>
-      </w:r>
-      <w:r>
-        <w:t xml:space="preserve">2</w:t>
-      </w:r>
-      <w:r>
-        <w:noBreakHyphen/>
-      </w:r>
-      <w:r>
-        <w:t xml:space="preserve">216(e) (permitting a citizen who begins residence in another state within 30 days of an election to vote in Georgia if the person is not admitted to vote in the new state). Thus, any voters who temporarily relocated during the pandemic to be closer to family or care for someone ill, or who moved for a few months to take college classes, or to work a summer job, or for any other number of perfectly valid reasons, may request to receive mail at an address other than where they registered to vote without forfeiting their right to vote in Georgia. Appellants’ allegations make no mention of when or why any voter actually moved, which would be critical for any threshold determination of the voter’s eligibility. There is nothing irregular or unusual about voting while outside of one’s voting jurisdiction; indeed, the availability of absentee voting accommodates exactly that. See O.C.G.A. § 21</w:t>
-      </w:r>
-      <w:r>
-        <w:noBreakHyphen/>
-      </w:r>
-      <w:r>
-        <w:t xml:space="preserve">2- 380(b).</w:t>
+        <w:t xml:space="preserve">These precautions are crucial because the fact that a voter moves temporarily or requests mail to be forwarded to another address—the primary basis for Appellants’ challenges—does not in any way render the voter ineligible to vote. While the place that a person receives significant mail, such as personal bills, may be evidence of the person’s residency for voter registration purposes, O.C.G.A. § 21-⁠2-⁠217(15), both the Election Code and federal law enumerate legitimate reasons that individuals may change their mail address, even out of state, without forfeiting their eligibility to vote. These reasons include: moving for temporary purposes, § 21-⁠2-⁠217(a)⁠(2); moving to engage in government service, § 21-⁠2-⁠217(a)⁠(11); and intending to move without actually moving, § 21-⁠2-⁠217(a)⁠(9). See also 52 U.S.C. § 20302(a)⁠(1) (providing for voting by absent uniformed voters and overseas voters); O.C.G.A. § 21-⁠2-⁠216(e) (permitting a citizen who begins residence in another state within 30 days of an election to vote in Georgia if the person is not admitted to vote in the new state). Thus, any voters who temporarily relocated during the pandemic to be closer to family or care for someone ill, or who moved for a few months to take college classes, or to work a summer job, or for any other number of perfectly valid reasons, may request to receive mail at an address other than where they registered to vote without forfeiting their right to vote in Georgia. Appellants’ allegations make no mention of when or why any voter actually moved, which would be critical for any threshold determination of the voter’s eligibility. There is nothing irregular or unusual about voting while outside of one’s voting jurisdiction; indeed, the availability of absentee voting accommodates exactly that. See O.C.G.A. § 21-⁠2-⁠380(b).</w:t>
       </w:r>
     </w:p>
     <w:p>
@@ -4639,7 +4515,7 @@
         <w:pStyle w:val="BodyText"/>
       </w:pPr>
       <w:r>
-        <w:t xml:space="preserve">The U.S. Constitution and federal statutes provide additional bases to affirm the Superior Court’s decision. In addition to dismissing the Petition based on the Superior Court’s interpretation of the NVRA and O.C.G.A. §§ 21</w:t>
+        <w:t xml:space="preserve">The U.S. Constitution and federal statutes provide additional bases to affirm the Superior Court’s decision. In addition to dismissing the Petition based on the Superior Court’s interpretation of the NVRA and O.C.G.A. §§ 21-⁠2-⁠229 and 21</w:t>
       </w:r>
       <w:r>
         <w:noBreakHyphen/>
@@ -4651,13 +4527,7 @@
         <w:noBreakHyphen/>
       </w:r>
       <w:r>
-        <w:t xml:space="preserve">229 and 21</w:t>
-      </w:r>
-      <w:r>
-        <w:noBreakHyphen/>
-      </w:r>
-      <w:r>
-        <w:t xml:space="preserve">2- 230, the court below also dismissed the Petition “for any [and] all other proper reasons allowable under Georgia law.” Order at 3. Federal law provides such additional proper reasons. See U.S. Const. Art. VI cl. 2 (Supremacy Clause).</w:t>
+        <w:t xml:space="preserve">230, the court below also dismissed the Petition “for any [and] all other proper reasons allowable under Georgia law.” Order at 3. Federal law provides such additional proper reasons. See U.S. Const. Art. VI cl. 2 (Supremacy Clause).</w:t>
       </w:r>
     </w:p>
     <w:p>
@@ -4935,7 +4805,7 @@
         <w:pStyle w:val="BodyText"/>
       </w:pPr>
       <w:r>
-        <w:t xml:space="preserve">Due process requires that all voters in Georgia be afforded meaningful notice before being removed from the voter registration rolls. As the Supreme Court recognized in Mullane v. Central Hanover Bank &amp; Trust Co., 339 U.S. 306, 314 (1950), “[a]n elementary and fundamental requirement of due process in any proceeding which is to be accorded finality is notice reasonably calculated, under all the circumstances, to apprise interested parties of the pendency of the action and afford them an opportunity to present their objections.” See also Fuentes v. Shevin, 407 U.S. 67, 82 (1972) (emphasizing the right to notice and a hearing “is no new principle of constitutional law,” and although “due process tolerates variances in the form of a hearing ‘appropriate to the nature of the case,’ . . . the Court has traditionally insisted that, whatever its form, opportunity for that hearing must be provided before the deprivation at issue takes effect”) (quoting Mullane, 339 U.S. at 313, and Boddie v. Connecticut, 401 U.S. 371, 378 (1971)). It was clear from the inception of this lawsuit that there was simply no way the Board could properly notice over 14,000 individual hearings, much less hold them, in the tight window before the voter registration period closed, meaning that the hearings would necessarily take place after that registration deadline had passed, barring any wrongfully removed voters from re-registering in time to vote in the coming election.</w:t>
+        <w:t xml:space="preserve">Due process requires that all voters in Georgia be afforded meaningful notice before being removed from the voter registration rolls. As the Supreme Court recognized in Mullane v. Central Hanover Bank &amp; Trust Co., 339 U.S. 306, 314 (1950), “[a]n elementary and fundamental requirement of due process in any proceeding which is to be accorded finality is notice reasonably calculated, under all the circumstances, to apprise interested parties of the pendency of the action and afford them an opportunity to present their objections.” See also Fuentes v. Shevin, 407 U.S. 67, 82 (1972) (emphasizing the right to notice and a hearing “is no new principle of constitutional law,” and although “due process tolerates variances in the form of a hearing ‘appropriate to the nature of the case,’ . . . the Court has traditionally insisted that, whatever its form, opportunity for that hearing must be provided before the deprivation at issue takes effect”) (quoting Mullane, 339 U.S. at 313, and Boddie v. Connecticut, 401 U.S. 371, 378 (1971)). It was clear from the inception of this lawsuit that there was simply no way the Board could properly notice over 14,000 individual hearings, much less hold them, in the tight window before the voter registration period closed, meaning that the hearings would necessarily take place after that registration deadline had passed, barring any wrongfully removed voters from re-registering in time to vote in the coming election.</w:t>
       </w:r>
     </w:p>
     <w:p>
@@ -4955,7 +4825,7 @@
         <w:noBreakHyphen/>
       </w:r>
       <w:r>
-        <w:t xml:space="preserve">229(b) requires the Board to provide by mail “at least three days’ notice of the date, time, and place” of any hearing, given the preciousness of the right at stake, a single mailing noticing a hearing three days in advance is likely insufficient. Indeed, under normal circumstances the U.S. Postal Service has indicated that election-related mail takes at least a week to be delivered. See, e.g., U.S. Postal Service, New for the 2018 Election Cycle, https://about.usps.com/​postal-bulletin/2018/​pb22498/​html/​cover_006.htm (last visited Dec. 10, 2020) (recommending voters mail their ballots at least one week before the due date). Given this, it was likely to take far longer for mail concerning any scheduled hearing to arrive when the Superior Court ruled, meaning that many Targeted Voters would have been unlikely to receive their notice in time for any hearing scheduled before the November election. And the right to vote may not be conditioned on voters’ maintenance of a regular mailing address, fastidious and immediate review of every piece of mail received, or their flexibility to drop everything in their regular life to defend their registration at an administrative hearing. Indeed, it is precisely for this reason that the NVRA mandates that systemic purges of voters not take place within 90 days of an election. See supra at Part I.B.2. The Due Process Clause does not permit hearings that could result in the removal of voters from registration rolls with only the scant notice that Appellants appear to contemplate.</w:t>
+        <w:t xml:space="preserve">229(b) requires the Board to provide by mail “at least three days’ notice of the date, time, and place” of any hearing, given the preciousness of the right at stake, a single mailing noticing a hearing three days in advance is likely insufficient. Indeed, under normal circumstances the U.S. Postal Service has indicated that election-related mail takes at least a week to be delivered. See, e.g., U.S. Postal Service, New for the 2018 Election Cycle, https://​about.​usps.​com/​postal-​bulletin/​2018/​pb22498/​html/​cover_006.​htm (last visited Dec. 10, 2020) (recommending voters mail their ballots at least one week before the due date). Given this, it was likely to take far longer for mail concerning any scheduled hearing to arrive when the Superior Court ruled, meaning that many Targeted Voters would have been unlikely to receive their notice in time for any hearing scheduled before the November election. And the right to vote may not be conditioned on voters’ maintenance of a regular mailing address, fastidious and immediate review of every piece of mail received, or their flexibility to drop everything in their regular life to defend their registration at an administrative hearing. Indeed, it is precisely for this reason that the NVRA mandates that systemic purges of voters not take place within 90 days of an election. See supra at Part I.B.2. The Due Process Clause does not permit hearings that could result in the removal of voters from registration rolls with only the scant notice that Appellants appear to contemplate.</w:t>
       </w:r>
     </w:p>
     <w:p>
@@ -4963,7 +4833,7 @@
         <w:pStyle w:val="BodyText"/>
       </w:pPr>
       <w:r>
-        <w:t xml:space="preserve">Second, the Board must provide meaningful, individualized review. See, e.g., Armstrong v. Manzo, 380 U.S. 545, 552 (1965) (holding “[a] fundamental requirement of due process is ‘the opportunity to be heard’ . . . which must be granted at a meaningful time and in a meaningful manner”). If the Board spends only a single minute reviewing the qualifications of each of the 14,346 challenged individuals and holds continuous challenge hearings 24 hours a day, it would still take 10 days for the Board to complete the hearings requested by Appellants. Thus, it is fanciful to assume the hearings could have been completed in the furious run-up to the November election, or that they could be completed now upon remand before the impending January 5 run-off elections. Of course, if the Board were to rush through hearings without the voter’s participation and revoke the right to vote based on cursory acceptance of third-party assertions, the procedural violation would be undeniably egregious. And yet this appears to be precisely the outcome that Appellants have sought and continue to seek to compel.</w:t>
+        <w:t xml:space="preserve">Second, the Board must provide meaningful, individualized review. See, e.g., Armstrong v. Manzo, 380 U.S. 545, 552 (1965) (holding “[a] fundamental requirement of due process is ‘the opportunity to be heard’ . . . which must be granted at a meaningful time and in a meaningful manner”). If the Board spends only a single minute reviewing the qualifications of each of the 14,346 challenged individuals and holds continuous challenge hearings 24 hours a day, it would still take 10 days for the Board to complete the hearings requested by Appellants. Thus, it is fanciful to assume the hearings could have been completed in the furious run-up to the November election, or that they could be completed now upon remand before the impending January 5 run-off elections. Of course, if the Board were to rush through hearings without the voter’s participation and revoke the right to vote based on cursory acceptance of third-party assertions, the procedural violation would be undeniably egregious. And yet this appears to be precisely the outcome that Appellants have sought and continue to seek to compel.</w:t>
       </w:r>
     </w:p>
     <w:p>
@@ -5594,7 +5464,7 @@
     </w:p>
     <w:p>
       <w:pPr>
-        <w:pStyle w:val="BodyText"/>
+        <w:pStyle w:val="BodyTextKeep"/>
       </w:pPr>
       <w:r>
         <w:t xml:space="preserve">As the Superior Court correctly recognized, a writ of mandamus here would be an unwarranted use of its power to supplant its discretion for that of duly appointed election officials carrying out their duties in accordance with Georgia and federal law. Perhaps even more importantly, a writ of mandamus would further the ends of voter suppression targeting minority communities in Fulton County and make the Court a tool of racially discriminatory voter intimidation. For the reasons stated above, the judgment below should be affirmed.</w:t>
@@ -7904,13 +7774,7 @@
         <w:t xml:space="preserve"> </w:t>
       </w:r>
       <w:r>
-        <w:t xml:space="preserve">The need for “immediate consideration” is specific to challenges to the right to vote because these challenge may be brought as the challenged elector attempts to cast a ballot, requiring contemporaneous resolution. Indeed, the only requirement for an immediate hearing applies in the narrow circumstances where a challenged individual’s vote will imminently be cast or counted. See, e.g., O.C.G.A. § 21</w:t>
-      </w:r>
-      <w:r>
-        <w:noBreakHyphen/>
-      </w:r>
-      <w:r>
-        <w:t xml:space="preserve">2- 230(h) (“If the challenged elector appears at the polls to vote and it is practical to conduct a hearing on the challenge prior to the close of the polls, the registrars shall conduct such hearing and determine the merits of the challenge.”).</w:t>
+        <w:t xml:space="preserve">The need for “immediate consideration” is specific to challenges to the right to vote because these challenge may be brought as the challenged elector attempts to cast a ballot, requiring contemporaneous resolution. Indeed, the only requirement for an immediate hearing applies in the narrow circumstances where a challenged individual’s vote will imminently be cast or counted. See, e.g., O.C.G.A. § 21-⁠2-⁠230(h) (“If the challenged elector appears at the polls to vote and it is practical to conduct a hearing on the challenge prior to the close of the polls, the registrars shall conduct such hearing and determine the merits of the challenge.”).</w:t>
       </w:r>
     </w:p>
   </w:footnote>
@@ -8677,6 +8541,7 @@
     <w:unhideWhenUsed/>
     <w:qFormat/>
     <w:pPr>
+      <w:keepLines/>
       <w:spacing w:before="0" w:after="160" w:line="322" w:lineRule="exact"/>
     </w:pPr>
     <w:rPr>
@@ -8875,6 +8740,15 @@
       <w:ind w:firstLine="0"/>
     </w:pPr>
   </w:style>
+  <w:style w:type="paragraph" w:customStyle="1" w:styleId="BodyTextKeep">
+    <w:name w:val="Body Text Keep"/>
+    <w:basedOn w:val="BodyText"/>
+    <w:qFormat/>
+    <w:pPr>
+      <w:keepNext/>
+      <w:keepLines/>
+    </w:pPr>
+  </w:style>
   <w:style w:type="paragraph" w:customStyle="1" w:styleId="XdList1">
     <w:name w:val="XdList 1"/>
     <w:basedOn w:val="Normal"/>
@@ -8927,6 +8801,33 @@
     <w:pPr>
       <w:spacing w:before="0" w:after="0" w:line="322" w:lineRule="exact"/>
       <w:ind w:left="2160" w:hanging="720"/>
+    </w:pPr>
+  </w:style>
+  <w:style w:type="paragraph" w:customStyle="1" w:styleId="XdQuoteList1">
+    <w:name w:val="Xd Quote List 1"/>
+    <w:basedOn w:val="Normal"/>
+    <w:qFormat/>
+    <w:pPr>
+      <w:spacing w:before="0" w:after="0" w:line="322" w:lineRule="exact"/>
+      <w:ind w:left="1440" w:right="720" w:hanging="720"/>
+    </w:pPr>
+  </w:style>
+  <w:style w:type="paragraph" w:customStyle="1" w:styleId="XdQuoteList2">
+    <w:name w:val="Xd Quote List 2"/>
+    <w:basedOn w:val="Normal"/>
+    <w:qFormat/>
+    <w:pPr>
+      <w:spacing w:before="0" w:after="0" w:line="322" w:lineRule="exact"/>
+      <w:ind w:left="2160" w:right="720" w:hanging="720"/>
+    </w:pPr>
+  </w:style>
+  <w:style w:type="paragraph" w:customStyle="1" w:styleId="XdQuoteList3">
+    <w:name w:val="Xd Quote List 3"/>
+    <w:basedOn w:val="Normal"/>
+    <w:qFormat/>
+    <w:pPr>
+      <w:spacing w:before="0" w:after="0" w:line="322" w:lineRule="exact"/>
+      <w:ind w:left="2880" w:right="720" w:hanging="720"/>
     </w:pPr>
   </w:style>
   <w:style w:type="paragraph" w:customStyle="1" w:styleId="XdList1">

</xml_diff>